<commit_message>
docs(qa): registro de DEF-015 y regeneracion de informes formales de defectos
- Registra DEF-015 en 04-DEFECT-LOG.md por contaminacion cruzada de perfil entre sesiones
- Genera informe formal DEF-2026-015_Aislamiento_Perfil_Cache_Sesiones.docx
- Actualiza 00_INDICE_MAESTRO_INFORMES_DEFECTOS.docx con 15 defectos documentados
- Mantiene la trazabilidad y estandar de calidad formal del proyecto
</commit_message>
<xml_diff>
--- a/docs/qa/00_INDICE_MAESTRO_INFORMES_DEFECTOS.docx
+++ b/docs/qa/00_INDICE_MAESTRO_INFORMES_DEFECTOS.docx
@@ -1960,6 +1960,128 @@
           </w:p>
         </w:tc>
       </w:tr>
+      <w:tr>
+        <w:tc>
+          <w:tcPr>
+            <w:tcW w:type="dxa" w:w="1728"/>
+            <w:vAlign w:val="center"/>
+            <w:tcMar>
+              <w:top w:w="60" w:type="dxa"/>
+              <w:bottom w:w="60" w:type="dxa"/>
+              <w:left w:w="80" w:type="dxa"/>
+              <w:right w:w="80" w:type="dxa"/>
+            </w:tcMar>
+          </w:tcPr>
+          <w:p>
+            <w:pPr>
+              <w:spacing w:after="0" w:line="264" w:lineRule="auto"/>
+            </w:pPr>
+            <w:r>
+              <w:rPr>
+                <w:b/>
+                <w:sz w:val="16"/>
+              </w:rPr>
+              <w:t>DEF-2026-015</w:t>
+            </w:r>
+          </w:p>
+        </w:tc>
+        <w:tc>
+          <w:tcPr>
+            <w:tcW w:type="dxa" w:w="1872"/>
+            <w:vAlign w:val="center"/>
+            <w:tcMar>
+              <w:top w:w="60" w:type="dxa"/>
+              <w:bottom w:w="60" w:type="dxa"/>
+              <w:left w:w="80" w:type="dxa"/>
+              <w:right w:w="80" w:type="dxa"/>
+            </w:tcMar>
+          </w:tcPr>
+          <w:p>
+            <w:pPr>
+              <w:spacing w:after="0" w:line="264" w:lineRule="auto"/>
+            </w:pPr>
+            <w:r>
+              <w:rPr>
+                <w:b w:val="0"/>
+                <w:sz w:val="16"/>
+              </w:rPr>
+              <w:t>Perfil / Sesiones</w:t>
+            </w:r>
+          </w:p>
+        </w:tc>
+        <w:tc>
+          <w:tcPr>
+            <w:tcW w:type="dxa" w:w="3888"/>
+            <w:vAlign w:val="center"/>
+            <w:tcMar>
+              <w:top w:w="60" w:type="dxa"/>
+              <w:bottom w:w="60" w:type="dxa"/>
+              <w:left w:w="80" w:type="dxa"/>
+              <w:right w:w="80" w:type="dxa"/>
+            </w:tcMar>
+          </w:tcPr>
+          <w:p>
+            <w:pPr>
+              <w:spacing w:after="0" w:line="264" w:lineRule="auto"/>
+            </w:pPr>
+            <w:r>
+              <w:rPr>
+                <w:b w:val="0"/>
+                <w:sz w:val="16"/>
+              </w:rPr>
+              <w:t>Aislamiento estricto de perfil y purga de caché en cambios de sesión</w:t>
+            </w:r>
+          </w:p>
+        </w:tc>
+        <w:tc>
+          <w:tcPr>
+            <w:tcW w:type="dxa" w:w="1152"/>
+            <w:vAlign w:val="center"/>
+            <w:tcMar>
+              <w:top w:w="60" w:type="dxa"/>
+              <w:bottom w:w="60" w:type="dxa"/>
+              <w:left w:w="80" w:type="dxa"/>
+              <w:right w:w="80" w:type="dxa"/>
+            </w:tcMar>
+          </w:tcPr>
+          <w:p>
+            <w:pPr>
+              <w:spacing w:after="0" w:line="264" w:lineRule="auto"/>
+            </w:pPr>
+            <w:r>
+              <w:rPr>
+                <w:b w:val="0"/>
+                <w:sz w:val="16"/>
+              </w:rPr>
+              <w:t>Mayor</w:t>
+            </w:r>
+          </w:p>
+        </w:tc>
+        <w:tc>
+          <w:tcPr>
+            <w:tcW w:type="dxa" w:w="1008"/>
+            <w:vAlign w:val="center"/>
+            <w:tcMar>
+              <w:top w:w="60" w:type="dxa"/>
+              <w:bottom w:w="60" w:type="dxa"/>
+              <w:left w:w="80" w:type="dxa"/>
+              <w:right w:w="80" w:type="dxa"/>
+            </w:tcMar>
+          </w:tcPr>
+          <w:p>
+            <w:pPr>
+              <w:spacing w:after="0" w:line="264" w:lineRule="auto"/>
+            </w:pPr>
+            <w:r>
+              <w:rPr>
+                <w:b/>
+                <w:sz w:val="16"/>
+              </w:rPr>
+              <w:t>Cerrado</w:t>
+            </w:r>
+          </w:p>
+        </w:tc>
+      </w:tr>
     </w:tbl>
     <w:p>
       <w:pPr>

</xml_diff>

<commit_message>
docs(qa): retirar pdfs de chequeos e incorporar informes formales de defectos DEF-016 al DEF-021
</commit_message>
<xml_diff>
--- a/docs/qa/00_INDICE_MAESTRO_INFORMES_DEFECTOS.docx
+++ b/docs/qa/00_INDICE_MAESTRO_INFORMES_DEFECTOS.docx
@@ -60,7 +60,7 @@
                 <w:color w:val="5A5A5A"/>
                 <w:sz w:val="15"/>
               </w:rPr>
-              <w:t>TOTAL: 14 DEFECTOS CERRADOS</w:t>
+              <w:t>TOTAL: 21 DEFECTOS CERRADOS</w:t>
             </w:r>
           </w:p>
         </w:tc>
@@ -92,7 +92,7 @@
           <w:color w:val="5A5A5A"/>
           <w:sz w:val="19"/>
         </w:rPr>
-        <w:t>Consolidado oficial de las 14 no conformidades detectadas, analizadas y resueltas durante el ciclo de pruebas de QA.</w:t>
+        <w:t>Consolidado oficial de las 21 no conformidades detectadas, analizadas y resueltas durante el ciclo de pruebas de QA.</w:t>
       </w:r>
     </w:p>
     <w:p>
@@ -100,7 +100,7 @@
         <w:spacing w:after="160" w:line="276" w:lineRule="auto"/>
       </w:pPr>
       <w:r>
-        <w:t>El presente índice relaciona los 14 informes técnicos individuales generados en formato Microsoft Word (.docx), los cuales documentan el diagnóstico de causa raíz (RCA), la solución implementada a nivel de código y base de datos, y las evidencias de verificación automatizada. Todos los defectos reportados se encuentran actualmente en estado CERRADO / VERIFICADO con 100% de pruebas unitarias y de integración aprobadas (56 en Backend, 160 en Frontend).</w:t>
+        <w:t>El presente índice relaciona los 21 informes técnicos individuales generados en formato Microsoft Word (.docx), los cuales documentan el diagnóstico de causa raíz (RCA), la solución implementada a nivel de código y base de datos, y las evidencias de verificación automatizada. Todos los defectos reportados se encuentran actualmente en estado CERRADO / VERIFICADO con 100% de pruebas unitarias y de integración aprobadas (56 en Backend, 182 en Frontend).</w:t>
       </w:r>
     </w:p>
     <w:tbl>
@@ -2082,6 +2082,738 @@
           </w:p>
         </w:tc>
       </w:tr>
+      <w:tr>
+        <w:tc>
+          <w:tcPr>
+            <w:tcW w:type="dxa" w:w="1728"/>
+            <w:vAlign w:val="center"/>
+            <w:tcMar>
+              <w:top w:w="60" w:type="dxa"/>
+              <w:bottom w:w="60" w:type="dxa"/>
+              <w:left w:w="80" w:type="dxa"/>
+              <w:right w:w="80" w:type="dxa"/>
+            </w:tcMar>
+          </w:tcPr>
+          <w:p>
+            <w:pPr>
+              <w:spacing w:after="0" w:line="264" w:lineRule="auto"/>
+            </w:pPr>
+            <w:r>
+              <w:rPr>
+                <w:b/>
+                <w:sz w:val="16"/>
+              </w:rPr>
+              <w:t>DEF-2026-016</w:t>
+            </w:r>
+          </w:p>
+        </w:tc>
+        <w:tc>
+          <w:tcPr>
+            <w:tcW w:type="dxa" w:w="1872"/>
+            <w:vAlign w:val="center"/>
+            <w:tcMar>
+              <w:top w:w="60" w:type="dxa"/>
+              <w:bottom w:w="60" w:type="dxa"/>
+              <w:left w:w="80" w:type="dxa"/>
+              <w:right w:w="80" w:type="dxa"/>
+            </w:tcMar>
+          </w:tcPr>
+          <w:p>
+            <w:pPr>
+              <w:spacing w:after="0" w:line="264" w:lineRule="auto"/>
+            </w:pPr>
+            <w:r>
+              <w:rPr>
+                <w:b w:val="0"/>
+                <w:sz w:val="16"/>
+              </w:rPr>
+              <w:t>Todos los Roles</w:t>
+            </w:r>
+          </w:p>
+        </w:tc>
+        <w:tc>
+          <w:tcPr>
+            <w:tcW w:type="dxa" w:w="3888"/>
+            <w:vAlign w:val="center"/>
+            <w:tcMar>
+              <w:top w:w="60" w:type="dxa"/>
+              <w:bottom w:w="60" w:type="dxa"/>
+              <w:left w:w="80" w:type="dxa"/>
+              <w:right w:w="80" w:type="dxa"/>
+            </w:tcMar>
+          </w:tcPr>
+          <w:p>
+            <w:pPr>
+              <w:spacing w:after="0" w:line="264" w:lineRule="auto"/>
+            </w:pPr>
+            <w:r>
+              <w:rPr>
+                <w:b w:val="0"/>
+                <w:sz w:val="16"/>
+              </w:rPr>
+              <w:t>Responsividad y adaptabilidad móvil en dashboards y formularios</w:t>
+            </w:r>
+          </w:p>
+        </w:tc>
+        <w:tc>
+          <w:tcPr>
+            <w:tcW w:type="dxa" w:w="1152"/>
+            <w:vAlign w:val="center"/>
+            <w:tcMar>
+              <w:top w:w="60" w:type="dxa"/>
+              <w:bottom w:w="60" w:type="dxa"/>
+              <w:left w:w="80" w:type="dxa"/>
+              <w:right w:w="80" w:type="dxa"/>
+            </w:tcMar>
+          </w:tcPr>
+          <w:p>
+            <w:pPr>
+              <w:spacing w:after="0" w:line="264" w:lineRule="auto"/>
+            </w:pPr>
+            <w:r>
+              <w:rPr>
+                <w:b w:val="0"/>
+                <w:sz w:val="16"/>
+              </w:rPr>
+              <w:t>Mayor</w:t>
+            </w:r>
+          </w:p>
+        </w:tc>
+        <w:tc>
+          <w:tcPr>
+            <w:tcW w:type="dxa" w:w="1008"/>
+            <w:vAlign w:val="center"/>
+            <w:tcMar>
+              <w:top w:w="60" w:type="dxa"/>
+              <w:bottom w:w="60" w:type="dxa"/>
+              <w:left w:w="80" w:type="dxa"/>
+              <w:right w:w="80" w:type="dxa"/>
+            </w:tcMar>
+          </w:tcPr>
+          <w:p>
+            <w:pPr>
+              <w:spacing w:after="0" w:line="264" w:lineRule="auto"/>
+            </w:pPr>
+            <w:r>
+              <w:rPr>
+                <w:b/>
+                <w:sz w:val="16"/>
+              </w:rPr>
+              <w:t>Cerrado</w:t>
+            </w:r>
+          </w:p>
+        </w:tc>
+      </w:tr>
+      <w:tr>
+        <w:tc>
+          <w:tcPr>
+            <w:tcW w:type="dxa" w:w="1728"/>
+            <w:vAlign w:val="center"/>
+            <w:tcMar>
+              <w:top w:w="60" w:type="dxa"/>
+              <w:bottom w:w="60" w:type="dxa"/>
+              <w:left w:w="80" w:type="dxa"/>
+              <w:right w:w="80" w:type="dxa"/>
+            </w:tcMar>
+          </w:tcPr>
+          <w:p>
+            <w:pPr>
+              <w:spacing w:after="0" w:line="264" w:lineRule="auto"/>
+            </w:pPr>
+            <w:r>
+              <w:rPr>
+                <w:b/>
+                <w:sz w:val="16"/>
+              </w:rPr>
+              <w:t>DEF-2026-017</w:t>
+            </w:r>
+          </w:p>
+        </w:tc>
+        <w:tc>
+          <w:tcPr>
+            <w:tcW w:type="dxa" w:w="1872"/>
+            <w:vAlign w:val="center"/>
+            <w:tcMar>
+              <w:top w:w="60" w:type="dxa"/>
+              <w:bottom w:w="60" w:type="dxa"/>
+              <w:left w:w="80" w:type="dxa"/>
+              <w:right w:w="80" w:type="dxa"/>
+            </w:tcMar>
+          </w:tcPr>
+          <w:p>
+            <w:pPr>
+              <w:spacing w:after="0" w:line="264" w:lineRule="auto"/>
+            </w:pPr>
+            <w:r>
+              <w:rPr>
+                <w:b w:val="0"/>
+                <w:sz w:val="16"/>
+              </w:rPr>
+              <w:t>Coordinador</w:t>
+            </w:r>
+          </w:p>
+        </w:tc>
+        <w:tc>
+          <w:tcPr>
+            <w:tcW w:type="dxa" w:w="3888"/>
+            <w:vAlign w:val="center"/>
+            <w:tcMar>
+              <w:top w:w="60" w:type="dxa"/>
+              <w:bottom w:w="60" w:type="dxa"/>
+              <w:left w:w="80" w:type="dxa"/>
+              <w:right w:w="80" w:type="dxa"/>
+            </w:tcMar>
+          </w:tcPr>
+          <w:p>
+            <w:pPr>
+              <w:spacing w:after="0" w:line="264" w:lineRule="auto"/>
+            </w:pPr>
+            <w:r>
+              <w:rPr>
+                <w:b w:val="0"/>
+                <w:sz w:val="16"/>
+              </w:rPr>
+              <w:t>Bloqueo de prioridad y decisiones en expedientes cerrados</w:t>
+            </w:r>
+          </w:p>
+        </w:tc>
+        <w:tc>
+          <w:tcPr>
+            <w:tcW w:type="dxa" w:w="1152"/>
+            <w:vAlign w:val="center"/>
+            <w:tcMar>
+              <w:top w:w="60" w:type="dxa"/>
+              <w:bottom w:w="60" w:type="dxa"/>
+              <w:left w:w="80" w:type="dxa"/>
+              <w:right w:w="80" w:type="dxa"/>
+            </w:tcMar>
+          </w:tcPr>
+          <w:p>
+            <w:pPr>
+              <w:spacing w:after="0" w:line="264" w:lineRule="auto"/>
+            </w:pPr>
+            <w:r>
+              <w:rPr>
+                <w:b w:val="0"/>
+                <w:sz w:val="16"/>
+              </w:rPr>
+              <w:t>Mayor</w:t>
+            </w:r>
+          </w:p>
+        </w:tc>
+        <w:tc>
+          <w:tcPr>
+            <w:tcW w:type="dxa" w:w="1008"/>
+            <w:vAlign w:val="center"/>
+            <w:tcMar>
+              <w:top w:w="60" w:type="dxa"/>
+              <w:bottom w:w="60" w:type="dxa"/>
+              <w:left w:w="80" w:type="dxa"/>
+              <w:right w:w="80" w:type="dxa"/>
+            </w:tcMar>
+          </w:tcPr>
+          <w:p>
+            <w:pPr>
+              <w:spacing w:after="0" w:line="264" w:lineRule="auto"/>
+            </w:pPr>
+            <w:r>
+              <w:rPr>
+                <w:b/>
+                <w:sz w:val="16"/>
+              </w:rPr>
+              <w:t>Cerrado</w:t>
+            </w:r>
+          </w:p>
+        </w:tc>
+      </w:tr>
+      <w:tr>
+        <w:tc>
+          <w:tcPr>
+            <w:tcW w:type="dxa" w:w="1728"/>
+            <w:vAlign w:val="center"/>
+            <w:tcMar>
+              <w:top w:w="60" w:type="dxa"/>
+              <w:bottom w:w="60" w:type="dxa"/>
+              <w:left w:w="80" w:type="dxa"/>
+              <w:right w:w="80" w:type="dxa"/>
+            </w:tcMar>
+          </w:tcPr>
+          <w:p>
+            <w:pPr>
+              <w:spacing w:after="0" w:line="264" w:lineRule="auto"/>
+            </w:pPr>
+            <w:r>
+              <w:rPr>
+                <w:b/>
+                <w:sz w:val="16"/>
+              </w:rPr>
+              <w:t>DEF-2026-018</w:t>
+            </w:r>
+          </w:p>
+        </w:tc>
+        <w:tc>
+          <w:tcPr>
+            <w:tcW w:type="dxa" w:w="1872"/>
+            <w:vAlign w:val="center"/>
+            <w:tcMar>
+              <w:top w:w="60" w:type="dxa"/>
+              <w:bottom w:w="60" w:type="dxa"/>
+              <w:left w:w="80" w:type="dxa"/>
+              <w:right w:w="80" w:type="dxa"/>
+            </w:tcMar>
+          </w:tcPr>
+          <w:p>
+            <w:pPr>
+              <w:spacing w:after="0" w:line="264" w:lineRule="auto"/>
+            </w:pPr>
+            <w:r>
+              <w:rPr>
+                <w:b w:val="0"/>
+                <w:sz w:val="16"/>
+              </w:rPr>
+              <w:t>Coordinador</w:t>
+            </w:r>
+          </w:p>
+        </w:tc>
+        <w:tc>
+          <w:tcPr>
+            <w:tcW w:type="dxa" w:w="3888"/>
+            <w:vAlign w:val="center"/>
+            <w:tcMar>
+              <w:top w:w="60" w:type="dxa"/>
+              <w:bottom w:w="60" w:type="dxa"/>
+              <w:left w:w="80" w:type="dxa"/>
+              <w:right w:w="80" w:type="dxa"/>
+            </w:tcMar>
+          </w:tcPr>
+          <w:p>
+            <w:pPr>
+              <w:spacing w:after="0" w:line="264" w:lineRule="auto"/>
+            </w:pPr>
+            <w:r>
+              <w:rPr>
+                <w:b w:val="0"/>
+                <w:sz w:val="16"/>
+              </w:rPr>
+              <w:t>Reapertura controlada y motivada de expedientes cerrados</w:t>
+            </w:r>
+          </w:p>
+        </w:tc>
+        <w:tc>
+          <w:tcPr>
+            <w:tcW w:type="dxa" w:w="1152"/>
+            <w:vAlign w:val="center"/>
+            <w:tcMar>
+              <w:top w:w="60" w:type="dxa"/>
+              <w:bottom w:w="60" w:type="dxa"/>
+              <w:left w:w="80" w:type="dxa"/>
+              <w:right w:w="80" w:type="dxa"/>
+            </w:tcMar>
+          </w:tcPr>
+          <w:p>
+            <w:pPr>
+              <w:spacing w:after="0" w:line="264" w:lineRule="auto"/>
+            </w:pPr>
+            <w:r>
+              <w:rPr>
+                <w:b w:val="0"/>
+                <w:sz w:val="16"/>
+              </w:rPr>
+              <w:t>Media</w:t>
+            </w:r>
+          </w:p>
+        </w:tc>
+        <w:tc>
+          <w:tcPr>
+            <w:tcW w:type="dxa" w:w="1008"/>
+            <w:vAlign w:val="center"/>
+            <w:tcMar>
+              <w:top w:w="60" w:type="dxa"/>
+              <w:bottom w:w="60" w:type="dxa"/>
+              <w:left w:w="80" w:type="dxa"/>
+              <w:right w:w="80" w:type="dxa"/>
+            </w:tcMar>
+          </w:tcPr>
+          <w:p>
+            <w:pPr>
+              <w:spacing w:after="0" w:line="264" w:lineRule="auto"/>
+            </w:pPr>
+            <w:r>
+              <w:rPr>
+                <w:b/>
+                <w:sz w:val="16"/>
+              </w:rPr>
+              <w:t>Cerrado</w:t>
+            </w:r>
+          </w:p>
+        </w:tc>
+      </w:tr>
+      <w:tr>
+        <w:tc>
+          <w:tcPr>
+            <w:tcW w:type="dxa" w:w="1728"/>
+            <w:vAlign w:val="center"/>
+            <w:tcMar>
+              <w:top w:w="60" w:type="dxa"/>
+              <w:bottom w:w="60" w:type="dxa"/>
+              <w:left w:w="80" w:type="dxa"/>
+              <w:right w:w="80" w:type="dxa"/>
+            </w:tcMar>
+          </w:tcPr>
+          <w:p>
+            <w:pPr>
+              <w:spacing w:after="0" w:line="264" w:lineRule="auto"/>
+            </w:pPr>
+            <w:r>
+              <w:rPr>
+                <w:b/>
+                <w:sz w:val="16"/>
+              </w:rPr>
+              <w:t>DEF-2026-019</w:t>
+            </w:r>
+          </w:p>
+        </w:tc>
+        <w:tc>
+          <w:tcPr>
+            <w:tcW w:type="dxa" w:w="1872"/>
+            <w:vAlign w:val="center"/>
+            <w:tcMar>
+              <w:top w:w="60" w:type="dxa"/>
+              <w:bottom w:w="60" w:type="dxa"/>
+              <w:left w:w="80" w:type="dxa"/>
+              <w:right w:w="80" w:type="dxa"/>
+            </w:tcMar>
+          </w:tcPr>
+          <w:p>
+            <w:pPr>
+              <w:spacing w:after="0" w:line="264" w:lineRule="auto"/>
+            </w:pPr>
+            <w:r>
+              <w:rPr>
+                <w:b w:val="0"/>
+                <w:sz w:val="16"/>
+              </w:rPr>
+              <w:t>Técnico Evaluador</w:t>
+            </w:r>
+          </w:p>
+        </w:tc>
+        <w:tc>
+          <w:tcPr>
+            <w:tcW w:type="dxa" w:w="3888"/>
+            <w:vAlign w:val="center"/>
+            <w:tcMar>
+              <w:top w:w="60" w:type="dxa"/>
+              <w:bottom w:w="60" w:type="dxa"/>
+              <w:left w:w="80" w:type="dxa"/>
+              <w:right w:w="80" w:type="dxa"/>
+            </w:tcMar>
+          </w:tcPr>
+          <w:p>
+            <w:pPr>
+              <w:spacing w:after="0" w:line="264" w:lineRule="auto"/>
+            </w:pPr>
+            <w:r>
+              <w:rPr>
+                <w:b w:val="0"/>
+                <w:sz w:val="16"/>
+              </w:rPr>
+              <w:t>Buscador interactivo en tiempo real de criterios BPM</w:t>
+            </w:r>
+          </w:p>
+        </w:tc>
+        <w:tc>
+          <w:tcPr>
+            <w:tcW w:type="dxa" w:w="1152"/>
+            <w:vAlign w:val="center"/>
+            <w:tcMar>
+              <w:top w:w="60" w:type="dxa"/>
+              <w:bottom w:w="60" w:type="dxa"/>
+              <w:left w:w="80" w:type="dxa"/>
+              <w:right w:w="80" w:type="dxa"/>
+            </w:tcMar>
+          </w:tcPr>
+          <w:p>
+            <w:pPr>
+              <w:spacing w:after="0" w:line="264" w:lineRule="auto"/>
+            </w:pPr>
+            <w:r>
+              <w:rPr>
+                <w:b w:val="0"/>
+                <w:sz w:val="16"/>
+              </w:rPr>
+              <w:t>Media</w:t>
+            </w:r>
+          </w:p>
+        </w:tc>
+        <w:tc>
+          <w:tcPr>
+            <w:tcW w:type="dxa" w:w="1008"/>
+            <w:vAlign w:val="center"/>
+            <w:tcMar>
+              <w:top w:w="60" w:type="dxa"/>
+              <w:bottom w:w="60" w:type="dxa"/>
+              <w:left w:w="80" w:type="dxa"/>
+              <w:right w:w="80" w:type="dxa"/>
+            </w:tcMar>
+          </w:tcPr>
+          <w:p>
+            <w:pPr>
+              <w:spacing w:after="0" w:line="264" w:lineRule="auto"/>
+            </w:pPr>
+            <w:r>
+              <w:rPr>
+                <w:b/>
+                <w:sz w:val="16"/>
+              </w:rPr>
+              <w:t>Cerrado</w:t>
+            </w:r>
+          </w:p>
+        </w:tc>
+      </w:tr>
+      <w:tr>
+        <w:tc>
+          <w:tcPr>
+            <w:tcW w:type="dxa" w:w="1728"/>
+            <w:vAlign w:val="center"/>
+            <w:tcMar>
+              <w:top w:w="60" w:type="dxa"/>
+              <w:bottom w:w="60" w:type="dxa"/>
+              <w:left w:w="80" w:type="dxa"/>
+              <w:right w:w="80" w:type="dxa"/>
+            </w:tcMar>
+          </w:tcPr>
+          <w:p>
+            <w:pPr>
+              <w:spacing w:after="0" w:line="264" w:lineRule="auto"/>
+            </w:pPr>
+            <w:r>
+              <w:rPr>
+                <w:b/>
+                <w:sz w:val="16"/>
+              </w:rPr>
+              <w:t>DEF-2026-020</w:t>
+            </w:r>
+          </w:p>
+        </w:tc>
+        <w:tc>
+          <w:tcPr>
+            <w:tcW w:type="dxa" w:w="1872"/>
+            <w:vAlign w:val="center"/>
+            <w:tcMar>
+              <w:top w:w="60" w:type="dxa"/>
+              <w:bottom w:w="60" w:type="dxa"/>
+              <w:left w:w="80" w:type="dxa"/>
+              <w:right w:w="80" w:type="dxa"/>
+            </w:tcMar>
+          </w:tcPr>
+          <w:p>
+            <w:pPr>
+              <w:spacing w:after="0" w:line="264" w:lineRule="auto"/>
+            </w:pPr>
+            <w:r>
+              <w:rPr>
+                <w:b w:val="0"/>
+                <w:sz w:val="16"/>
+              </w:rPr>
+              <w:t>Consulta Histórica</w:t>
+            </w:r>
+          </w:p>
+        </w:tc>
+        <w:tc>
+          <w:tcPr>
+            <w:tcW w:type="dxa" w:w="3888"/>
+            <w:vAlign w:val="center"/>
+            <w:tcMar>
+              <w:top w:w="60" w:type="dxa"/>
+              <w:bottom w:w="60" w:type="dxa"/>
+              <w:left w:w="80" w:type="dxa"/>
+              <w:right w:w="80" w:type="dxa"/>
+            </w:tcMar>
+          </w:tcPr>
+          <w:p>
+            <w:pPr>
+              <w:spacing w:after="0" w:line="264" w:lineRule="auto"/>
+            </w:pPr>
+            <w:r>
+              <w:rPr>
+                <w:b w:val="0"/>
+                <w:sz w:val="16"/>
+              </w:rPr>
+              <w:t>Blindaje forzado en modo solo lectura para auditoría histórica</w:t>
+            </w:r>
+          </w:p>
+        </w:tc>
+        <w:tc>
+          <w:tcPr>
+            <w:tcW w:type="dxa" w:w="1152"/>
+            <w:vAlign w:val="center"/>
+            <w:tcMar>
+              <w:top w:w="60" w:type="dxa"/>
+              <w:bottom w:w="60" w:type="dxa"/>
+              <w:left w:w="80" w:type="dxa"/>
+              <w:right w:w="80" w:type="dxa"/>
+            </w:tcMar>
+          </w:tcPr>
+          <w:p>
+            <w:pPr>
+              <w:spacing w:after="0" w:line="264" w:lineRule="auto"/>
+            </w:pPr>
+            <w:r>
+              <w:rPr>
+                <w:b w:val="0"/>
+                <w:sz w:val="16"/>
+              </w:rPr>
+              <w:t>Crítica</w:t>
+            </w:r>
+          </w:p>
+        </w:tc>
+        <w:tc>
+          <w:tcPr>
+            <w:tcW w:type="dxa" w:w="1008"/>
+            <w:vAlign w:val="center"/>
+            <w:tcMar>
+              <w:top w:w="60" w:type="dxa"/>
+              <w:bottom w:w="60" w:type="dxa"/>
+              <w:left w:w="80" w:type="dxa"/>
+              <w:right w:w="80" w:type="dxa"/>
+            </w:tcMar>
+          </w:tcPr>
+          <w:p>
+            <w:pPr>
+              <w:spacing w:after="0" w:line="264" w:lineRule="auto"/>
+            </w:pPr>
+            <w:r>
+              <w:rPr>
+                <w:b/>
+                <w:sz w:val="16"/>
+              </w:rPr>
+              <w:t>Cerrado</w:t>
+            </w:r>
+          </w:p>
+        </w:tc>
+      </w:tr>
+      <w:tr>
+        <w:tc>
+          <w:tcPr>
+            <w:tcW w:type="dxa" w:w="1728"/>
+            <w:vAlign w:val="center"/>
+            <w:tcMar>
+              <w:top w:w="60" w:type="dxa"/>
+              <w:bottom w:w="60" w:type="dxa"/>
+              <w:left w:w="80" w:type="dxa"/>
+              <w:right w:w="80" w:type="dxa"/>
+            </w:tcMar>
+          </w:tcPr>
+          <w:p>
+            <w:pPr>
+              <w:spacing w:after="0" w:line="264" w:lineRule="auto"/>
+            </w:pPr>
+            <w:r>
+              <w:rPr>
+                <w:b/>
+                <w:sz w:val="16"/>
+              </w:rPr>
+              <w:t>DEF-2026-021</w:t>
+            </w:r>
+          </w:p>
+        </w:tc>
+        <w:tc>
+          <w:tcPr>
+            <w:tcW w:type="dxa" w:w="1872"/>
+            <w:vAlign w:val="center"/>
+            <w:tcMar>
+              <w:top w:w="60" w:type="dxa"/>
+              <w:bottom w:w="60" w:type="dxa"/>
+              <w:left w:w="80" w:type="dxa"/>
+              <w:right w:w="80" w:type="dxa"/>
+            </w:tcMar>
+          </w:tcPr>
+          <w:p>
+            <w:pPr>
+              <w:spacing w:after="0" w:line="264" w:lineRule="auto"/>
+            </w:pPr>
+            <w:r>
+              <w:rPr>
+                <w:b w:val="0"/>
+                <w:sz w:val="16"/>
+              </w:rPr>
+              <w:t>Técnico Evaluador</w:t>
+            </w:r>
+          </w:p>
+        </w:tc>
+        <w:tc>
+          <w:tcPr>
+            <w:tcW w:type="dxa" w:w="3888"/>
+            <w:vAlign w:val="center"/>
+            <w:tcMar>
+              <w:top w:w="60" w:type="dxa"/>
+              <w:bottom w:w="60" w:type="dxa"/>
+              <w:left w:w="80" w:type="dxa"/>
+              <w:right w:w="80" w:type="dxa"/>
+            </w:tcMar>
+          </w:tcPr>
+          <w:p>
+            <w:pPr>
+              <w:spacing w:after="0" w:line="264" w:lineRule="auto"/>
+            </w:pPr>
+            <w:r>
+              <w:rPr>
+                <w:b w:val="0"/>
+                <w:sz w:val="16"/>
+              </w:rPr>
+              <w:t>Modal con geolocalización GPS por criterio y confirmación de borrado</w:t>
+            </w:r>
+          </w:p>
+        </w:tc>
+        <w:tc>
+          <w:tcPr>
+            <w:tcW w:type="dxa" w:w="1152"/>
+            <w:vAlign w:val="center"/>
+            <w:tcMar>
+              <w:top w:w="60" w:type="dxa"/>
+              <w:bottom w:w="60" w:type="dxa"/>
+              <w:left w:w="80" w:type="dxa"/>
+              <w:right w:w="80" w:type="dxa"/>
+            </w:tcMar>
+          </w:tcPr>
+          <w:p>
+            <w:pPr>
+              <w:spacing w:after="0" w:line="264" w:lineRule="auto"/>
+            </w:pPr>
+            <w:r>
+              <w:rPr>
+                <w:b w:val="0"/>
+                <w:sz w:val="16"/>
+              </w:rPr>
+              <w:t>Mayor</w:t>
+            </w:r>
+          </w:p>
+        </w:tc>
+        <w:tc>
+          <w:tcPr>
+            <w:tcW w:type="dxa" w:w="1008"/>
+            <w:vAlign w:val="center"/>
+            <w:tcMar>
+              <w:top w:w="60" w:type="dxa"/>
+              <w:bottom w:w="60" w:type="dxa"/>
+              <w:left w:w="80" w:type="dxa"/>
+              <w:right w:w="80" w:type="dxa"/>
+            </w:tcMar>
+          </w:tcPr>
+          <w:p>
+            <w:pPr>
+              <w:spacing w:after="0" w:line="264" w:lineRule="auto"/>
+            </w:pPr>
+            <w:r>
+              <w:rPr>
+                <w:b/>
+                <w:sz w:val="16"/>
+              </w:rPr>
+              <w:t>Cerrado</w:t>
+            </w:r>
+          </w:p>
+        </w:tc>
+      </w:tr>
     </w:tbl>
     <w:p>
       <w:pPr>

</xml_diff>